<commit_message>
Feat: Modificação de site para software
</commit_message>
<xml_diff>
--- a/Documentação/Escopo (8).docx
+++ b/Documentação/Escopo (8).docx
@@ -790,7 +790,13 @@
               <w:jc w:val="center"/>
             </w:pPr>
             <w:r>
-              <w:t>O site deve possuir botões clicáveis em todas as páginas web, que redireciona para as outras páginas</w:t>
+              <w:t xml:space="preserve">O </w:t>
+            </w:r>
+            <w:r>
+              <w:t>software</w:t>
+            </w:r>
+            <w:r>
+              <w:t xml:space="preserve"> deve possuir botões clicáveis em todas as páginas web, que redireciona para as outras páginas</w:t>
             </w:r>
           </w:p>
         </w:tc>
@@ -869,7 +875,13 @@
               <w:jc w:val="center"/>
             </w:pPr>
             <w:r>
-              <w:t>A página home do site deve possuir um dashboard, exibindo gráficos a partir dos dados armazenados no banco de dados</w:t>
+              <w:t xml:space="preserve">A página home do </w:t>
+            </w:r>
+            <w:r>
+              <w:t>software</w:t>
+            </w:r>
+            <w:r>
+              <w:t xml:space="preserve"> deve possuir um dashboard, exibindo gráficos a partir dos dados armazenados no banco de dados</w:t>
             </w:r>
           </w:p>
         </w:tc>
@@ -948,7 +960,13 @@
               <w:jc w:val="center"/>
             </w:pPr>
             <w:r>
-              <w:t>O sistema deve possuir um banco de dados relacional, para armazenar os dados da empresa, enquanto garante a integridade e relacionamento dos dados</w:t>
+              <w:t xml:space="preserve">O </w:t>
+            </w:r>
+            <w:r>
+              <w:t>software</w:t>
+            </w:r>
+            <w:r>
+              <w:t xml:space="preserve"> deve possuir um banco de dados relacional, para armazenar os dados da empresa, enquanto garante a integridade e relacionamento dos dados</w:t>
             </w:r>
           </w:p>
         </w:tc>
@@ -1028,7 +1046,13 @@
               <w:jc w:val="center"/>
             </w:pPr>
             <w:r>
-              <w:t>O site deve possuir a página de login, que valida, através de busca no banco de dados, se o usuário do site possui permissão para acessa-lo, validando e-mail e senha</w:t>
+              <w:t xml:space="preserve">O </w:t>
+            </w:r>
+            <w:r>
+              <w:t>software</w:t>
+            </w:r>
+            <w:r>
+              <w:t xml:space="preserve"> deve possuir a página de login, que valida, através de busca no banco de dados, se o usuário do site possui permissão para acessa-lo, validando e-mail e senha</w:t>
             </w:r>
           </w:p>
         </w:tc>
@@ -1107,7 +1131,13 @@
               <w:jc w:val="center"/>
             </w:pPr>
             <w:r>
-              <w:t>O site deve permitir que o usuário altere o tipo de gráfico no dashboard</w:t>
+              <w:t xml:space="preserve">O </w:t>
+            </w:r>
+            <w:r>
+              <w:t>software</w:t>
+            </w:r>
+            <w:r>
+              <w:t xml:space="preserve"> deve permitir que o usuário altere o tipo de gráfico no dashboard</w:t>
             </w:r>
           </w:p>
         </w:tc>
@@ -1186,7 +1216,13 @@
               <w:jc w:val="center"/>
             </w:pPr>
             <w:r>
-              <w:t>O site deve possuir uma página funcional de cadastro de funcionários, produtos e fornecedores</w:t>
+              <w:t xml:space="preserve">O </w:t>
+            </w:r>
+            <w:r>
+              <w:t>software</w:t>
+            </w:r>
+            <w:r>
+              <w:t xml:space="preserve"> deve possuir uma página funcional de cadastro de funcionários, produtos e fornecedores</w:t>
             </w:r>
           </w:p>
         </w:tc>
@@ -1265,7 +1301,13 @@
               <w:jc w:val="center"/>
             </w:pPr>
             <w:r>
-              <w:t>O site deve possuir uma página funcional de metas e desempenho, onde cada funcionário poderá visualizar o andamento do seu trabalho e o que ele precisa cumprir</w:t>
+              <w:t xml:space="preserve">O </w:t>
+            </w:r>
+            <w:r>
+              <w:t>software</w:t>
+            </w:r>
+            <w:r>
+              <w:t xml:space="preserve"> deve possuir uma página funcional de metas e desempenho, onde cada funcionário poderá visualizar o andamento do seu trabalho e o que ele precisa cumprir</w:t>
             </w:r>
           </w:p>
         </w:tc>
@@ -1423,7 +1465,19 @@
               <w:jc w:val="center"/>
             </w:pPr>
             <w:r>
-              <w:t>O site deve bloquear o login após 3 tentativas fracassadas de entrar</w:t>
+              <w:t>O</w:t>
+            </w:r>
+            <w:r>
+              <w:t xml:space="preserve"> </w:t>
+            </w:r>
+            <w:r>
+              <w:t>software</w:t>
+            </w:r>
+            <w:r>
+              <w:t xml:space="preserve"> </w:t>
+            </w:r>
+            <w:r>
+              <w:t>deve bloquear o login após 3 tentativas fracassadas de entrar</w:t>
             </w:r>
           </w:p>
         </w:tc>
@@ -1581,7 +1635,13 @@
               <w:jc w:val="center"/>
             </w:pPr>
             <w:r>
-              <w:t>O site deve possuir uma página de perfil, onde o usuário poderia acessar suas informações e alterar sua foto de perfil</w:t>
+              <w:t xml:space="preserve">O </w:t>
+            </w:r>
+            <w:r>
+              <w:t>software</w:t>
+            </w:r>
+            <w:r>
+              <w:t xml:space="preserve"> deve possuir uma página de perfil, onde o usuário poderia acessar suas informações e alterar sua foto de perfil</w:t>
             </w:r>
           </w:p>
         </w:tc>
@@ -1674,7 +1734,9 @@
           <w:szCs w:val="24"/>
         </w:rPr>
       </w:pPr>
+      <w:bookmarkStart w:id="0" w:name="_GoBack"/>
     </w:p>
+    <w:bookmarkEnd w:id="0"/>
     <w:p>
       <w:pPr>
         <w:spacing w:after="0" w:line="360" w:lineRule="auto"/>
@@ -3284,7 +3346,7 @@
                 <w:lang w:eastAsia="pt-BR"/>
               </w:rPr>
             </w:pPr>
-            <w:bookmarkStart w:id="0" w:name="RANGE!B1"/>
+            <w:bookmarkStart w:id="1" w:name="RANGE!B1"/>
             <w:r>
               <w:rPr>
                 <w:rFonts w:eastAsia="Times New Roman" w:cstheme="minorHAnsi"/>
@@ -3295,7 +3357,7 @@
               </w:rPr>
               <w:t>5. HISTÓRIAS DE USUÁRIO</w:t>
             </w:r>
-            <w:bookmarkEnd w:id="0"/>
+            <w:bookmarkEnd w:id="1"/>
           </w:p>
         </w:tc>
       </w:tr>
@@ -5176,7 +5238,7 @@
                 <w:lang w:eastAsia="pt-BR"/>
               </w:rPr>
             </w:pPr>
-            <w:bookmarkStart w:id="1" w:name="RANGE!B18"/>
+            <w:bookmarkStart w:id="2" w:name="RANGE!B18"/>
             <w:r>
               <w:rPr>
                 <w:rFonts w:eastAsia="Times New Roman" w:cstheme="minorHAnsi"/>
@@ -5188,7 +5250,7 @@
               <w:lastRenderedPageBreak/>
               <w:t>RF 006</w:t>
             </w:r>
-            <w:bookmarkEnd w:id="1"/>
+            <w:bookmarkEnd w:id="2"/>
           </w:p>
         </w:tc>
         <w:tc>
@@ -9663,7 +9725,6 @@
                 <w:color w:val="000000"/>
                 <w:lang w:eastAsia="pt-BR"/>
               </w:rPr>
-              <w:lastRenderedPageBreak/>
               <w:t>CUSTOS DE INFRAESTRUTURA APEX (6 MESES)</w:t>
             </w:r>
           </w:p>
@@ -9771,6 +9832,7 @@
                 <w:color w:val="000000"/>
                 <w:lang w:eastAsia="pt-BR"/>
               </w:rPr>
+              <w:lastRenderedPageBreak/>
               <w:t>Item</w:t>
             </w:r>
           </w:p>
@@ -17030,8 +17092,6 @@
                 <w:lang w:eastAsia="pt-BR"/>
               </w:rPr>
             </w:pPr>
-            <w:bookmarkStart w:id="2" w:name="_GoBack"/>
-            <w:bookmarkEnd w:id="2"/>
             <w:r>
               <w:rPr>
                 <w:rFonts w:cstheme="minorHAnsi"/>
@@ -19758,7 +19818,7 @@
 </file>
 
 <file path=customXml/itemProps1.xml><?xml version="1.0" encoding="utf-8"?>
-<ds:datastoreItem xmlns:ds="http://schemas.openxmlformats.org/officeDocument/2006/customXml" ds:itemID="{404CCC14-7556-4F30-A1FD-900B6FB70CC5}">
+<ds:datastoreItem xmlns:ds="http://schemas.openxmlformats.org/officeDocument/2006/customXml" ds:itemID="{CED6F263-0182-43A1-A1E3-2A3ADB25BDE1}">
   <ds:schemaRefs>
     <ds:schemaRef ds:uri="http://schemas.openxmlformats.org/officeDocument/2006/bibliography"/>
   </ds:schemaRefs>

</xml_diff>